<commit_message>
feat: new oral assessment form - simplified CEFR grades + criteria
</commit_message>
<xml_diff>
--- a/data/conventions/convention_5ed4e799e14b1daa176d246d247a4085ccc4d76c.docx
+++ b/data/conventions/convention_5ed4e799e14b1daa176d246d247a4085ccc4d76c.docx
@@ -132,7 +132,7 @@
           <w:szCs w:val="19"/>
           <w:lang w:val="fr-FR"/>
         </w:rPr>
-        <w:t xml:space="preserve">Et , SIRET , est conclue la convention suivante, en application des dispositions du Livre III de la sixième partie du code du travail portant organisation de la formation professionnelle. </w:t>
+        <w:t xml:space="preserve">Et B BRAUN, SIRET , est conclue la convention suivante, en application des dispositions du Livre III de la sixième partie du code du travail portant organisation de la formation professionnelle. </w:t>
       </w:r>
     </w:p>
     <w:p>
@@ -346,7 +346,7 @@
           <w:szCs w:val="19"/>
           <w:lang w:val="fr-FR"/>
         </w:rPr>
-        <w:t>Durée de l’action de formation : 10 heures</w:t>
+        <w:t>Durée de l’action de formation : 20 heures (10h formation + 10h travail autonome) heures</w:t>
       </w:r>
     </w:p>
     <w:p>
@@ -408,7 +408,7 @@
           <w:szCs w:val="19"/>
           <w:lang w:val="fr-FR"/>
         </w:rPr>
-        <w:t xml:space="preserve">Dates : </w:t>
+        <w:t>Dates : du 22 juin 2026 au 31 décembre 2026</w:t>
       </w:r>
     </w:p>
     <w:p>
@@ -504,7 +504,7 @@
           <w:szCs w:val="19"/>
           <w:lang w:val="fr-FR"/>
         </w:rPr>
-        <w:t>Niveau visé : B1+</w:t>
+        <w:t>Niveau visé : B2+ (3.5)</w:t>
       </w:r>
       <w:r>
         <w:rPr>
@@ -725,7 +725,7 @@
           <w:szCs w:val="19"/>
           <w:lang w:val="fr-FR"/>
         </w:rPr>
-        <w:t>Les frais de formation sont :  EUROS NET DE TAXES* à payer à réception de facture. Un cofinancement ou abondement est également possible du moment que l’accord de prise en charge est donné avant démarrage de la formation. Les tarifs comprennent les frais pédagogiques. (*Conformément à l'article 261-4-4° du Code général des impôts, nos activités de formation professionnelle continue sont exonérées de T.V.A.)</w:t>
+        <w:t>Les frais de formation sont :  3000,24 EUROS NET DE TAXES* à payer à réception de facture. Un cofinancement ou abondement est également possible du moment que l’accord de prise en charge est donné avant démarrage de la formation. Les tarifs comprennent les frais pédagogiques. (*Conformément à l'article 261-4-4° du Code général des impôts, nos activités de formation professionnelle continue sont exonérées de T.V.A.)</w:t>
       </w:r>
     </w:p>
     <w:p>
@@ -1233,7 +1233,7 @@
           <w:color w:val="1F497D" w:themeColor="text2"/>
           <w:lang w:val="fr-FR"/>
         </w:rPr>
-        <w:t xml:space="preserve">Pour </w:t>
+        <w:t>Pour B BRAUN</w:t>
         <w:tab/>
         <w:tab/>
         <w:tab/>

</xml_diff>